<commit_message>
docs: installation guide - align signing appendix with central signer + CI
Windows local signing delegates to the shared signer (az login); CI signs
via account-level variables/secrets with a self-gating step; macOS signing
runs on a Mac and is not set up yet.

Co-Authored-By: Claude Opus 4.8 <noreply@anthropic.com>
</commit_message>
<xml_diff>
--- a/docs/installation-guide/Activation_Planner_Installation_Guide.docx
+++ b/docs/installation-guide/Activation_Planner_Installation_Guide.docx
@@ -15477,7 +15477,7 @@
         <w:t>off by default</w:t>
       </w:r>
       <w:r>
-        <w:t xml:space="preserve"> and credential-gated, so the same pipeline makes signed or unsigned builds. Nothing in the scripts stores your certificates or passwords - they read values you set in environment variables, and you run the signed build.</w:t>
+        <w:t xml:space="preserve"> and credential-gated, so the same pipeline makes signed or unsigned builds. Nothing in the scripts stores certificates or passwords.</w:t>
       </w:r>
     </w:p>
     <w:p>
@@ -15499,10 +15499,10 @@
         <w:rPr>
           <w:b/>
         </w:rPr>
-        <w:t>Windows</w:t>
-      </w:r>
-      <w:r>
-        <w:t xml:space="preserve"> (from  package.ps1 , which calls  sign-windows.ps1 ): set  ACTIVATIONPLANNER_SIGN=trustedsigning  (Azure Trusted Signing) or  =keyvault  (Azure Key Vault cert), plus the mode's variables. A signed Windows build avoids the SmartScreen "unknown publisher" warning.</w:t>
+        <w:t>Windows, on your machine:</w:t>
+      </w:r>
+      <w:r>
+        <w:t xml:space="preserve">  package.ps1  calls  sign-windows.ps1 , which delegates to a single shared signer (default  C:\Dev\Signing and Distribution\azure\sign.ps1 , or  $env:SIGN_SCRIPT ). That script uses Azure Trusted Signing via the  sign  tool with  az login  auth. So: run  az login  once, then  package.ps1  produces a signed build; if you're not logged in (or the shared signer is absent) it skips cleanly and ships unsigned. A signed Windows build avoids the SmartScreen "unknown publisher" warning.</w:t>
       </w:r>
     </w:p>
     <w:p>
@@ -15524,10 +15524,71 @@
         <w:rPr>
           <w:b/>
         </w:rPr>
+        <w:t>Windows, in CI (GitHub Actions):</w:t>
+      </w:r>
+      <w:r>
+        <w:t xml:space="preserve"> the  release.yml  workflow signs with  azure/trusted-signing-action , reading config from repo/account </w:t>
+      </w:r>
+      <w:r>
+        <w:rPr>
+          <w:b/>
+        </w:rPr>
+        <w:t>variables</w:t>
+      </w:r>
+      <w:r>
+        <w:t xml:space="preserve"> ( AZURE_SIGNING_ENDPOINT ,  AZURE_SIGNING_ACCOUNT ,  AZURE_SIGNING_CERT_PROFILE ) and </w:t>
+      </w:r>
+      <w:r>
+        <w:rPr>
+          <w:b/>
+        </w:rPr>
+        <w:t>secrets</w:t>
+      </w:r>
+      <w:r>
+        <w:t xml:space="preserve"> ( AZURE_TENANT_ID ,  AZURE_CLIENT_ID ,  AZURE_CLIENT_SECRET ). The sign step self-gates on  AZURE_SIGNING_ACCOUNT , so it's dormant until those are set. Set them once at the </w:t>
+      </w:r>
+      <w:r>
+        <w:rPr>
+          <w:b/>
+        </w:rPr>
+        <w:t>account level</w:t>
+      </w:r>
+      <w:r>
+        <w:t xml:space="preserve"> and every repo inherits them.</w:t>
+      </w:r>
+    </w:p>
+    <w:p>
+      <w:pPr>
+        <w:tabs>
+          <w:tab w:pos="547" w:val="left"/>
+        </w:tabs>
+        <w:spacing w:after="80"/>
+        <w:ind w:left="547" w:hanging="288"/>
+      </w:pPr>
+      <w:r>
+        <w:rPr>
+          <w:color w:val="2E6DA4"/>
+        </w:rPr>
+        <w:t>▪</w:t>
+        <w:tab/>
+      </w:r>
+      <w:r>
+        <w:rPr>
+          <w:b/>
+        </w:rPr>
         <w:t>macOS</w:t>
       </w:r>
       <w:r>
-        <w:t xml:space="preserve"> (from  package.sh , which calls  sign-macos.sh ): set  ACTIVATIONPLANNER_SIGN=developerid  and  APPLE_SIGN_IDENTITY , plus notarization credentials (a stored  notarytool  profile, or APPLE_ID / APPLE_TEAM_ID / APPLE_APP_PASSWORD). A signed + notarized macOS build avoids the Gatekeeper "unidentified developer" block.</w:t>
+        <w:t xml:space="preserve"> (from  package.sh , which calls  sign-macos.sh ): set  ACTIVATIONPLANNER_SIGN=developerid  and  APPLE_SIGN_IDENTITY , plus notarization credentials. macOS signing must run </w:t>
+      </w:r>
+      <w:r>
+        <w:rPr>
+          <w:b/>
+        </w:rPr>
+        <w:t>on a Mac</w:t>
+      </w:r>
+      <w:r>
+        <w:t xml:space="preserve"> (codesign/notarytool are Apple-only). Not set up yet - macOS ships unsigned with the Gatekeeper fallback.</w:t>
       </w:r>
     </w:p>
     <w:tbl>

</xml_diff>